<commit_message>
Descarga de imagenes ahora filtrada por imagenes sencillas sumado al preprocesamiento de las imagenes, mascaras binarias aplicadas (blanco y negro)
</commit_message>
<xml_diff>
--- a/doc/ARTICULO INVESTIGACION.docx
+++ b/doc/ARTICULO INVESTIGACION.docx
@@ -442,6 +442,1101 @@
         </w:rPr>
         <w:t>Informe del proyecto</w:t>
       </w:r>
+    </w:p>
+    <w:p>
+      <w:pPr>
+        <w:rPr>
+          <w:lang w:val="es-ES"/>
+        </w:rPr>
+      </w:pPr>
+    </w:p>
+    <w:p>
+      <w:pPr>
+        <w:rPr>
+          <w:lang w:val="es-ES"/>
+        </w:rPr>
+      </w:pPr>
+    </w:p>
+    <w:p>
+      <w:pPr>
+        <w:rPr>
+          <w:lang w:val="es-ES"/>
+        </w:rPr>
+      </w:pPr>
+    </w:p>
+    <w:p>
+      <w:pPr>
+        <w:rPr>
+          <w:lang w:val="es-ES"/>
+        </w:rPr>
+      </w:pPr>
+    </w:p>
+    <w:p>
+      <w:pPr>
+        <w:rPr>
+          <w:lang w:val="es-ES"/>
+        </w:rPr>
+      </w:pPr>
+    </w:p>
+    <w:p>
+      <w:pPr>
+        <w:rPr>
+          <w:lang w:val="es-ES"/>
+        </w:rPr>
+      </w:pPr>
+      <w:r>
+        <w:rPr>
+          <w:lang w:val="es-ES"/>
+        </w:rPr>
+        <w:t xml:space="preserve">Seguimiento 1 </w:t>
+      </w:r>
+      <w:r>
+        <w:rPr>
+          <w:lang w:val="es-ES"/>
+        </w:rPr>
+        <w:sym w:font="Wingdings" w:char="F0E0"/>
+      </w:r>
+    </w:p>
+    <w:p>
+      <w:pPr>
+        <w:rPr>
+          <w:lang w:val="es-ES"/>
+        </w:rPr>
+      </w:pPr>
+    </w:p>
+    <w:p>
+      <w:pPr>
+        <w:rPr>
+          <w:lang w:val="es-ES"/>
+        </w:rPr>
+      </w:pPr>
+    </w:p>
+    <w:p>
+      <w:pPr>
+        <w:pStyle w:val="Prrafodelista"/>
+        <w:numPr>
+          <w:ilvl w:val="0"/>
+          <w:numId w:val="2"/>
+        </w:numPr>
+        <w:rPr>
+          <w:lang w:val="es-ES"/>
+        </w:rPr>
+      </w:pPr>
+      <w:r>
+        <w:rPr>
+          <w:lang w:val="es-ES"/>
+        </w:rPr>
+        <w:t>Miembros del grupo proponen un trabajo dirigido: SI</w:t>
+      </w:r>
+    </w:p>
+    <w:p>
+      <w:pPr>
+        <w:pStyle w:val="Prrafodelista"/>
+        <w:numPr>
+          <w:ilvl w:val="0"/>
+          <w:numId w:val="2"/>
+        </w:numPr>
+        <w:rPr>
+          <w:lang w:val="es-ES"/>
+        </w:rPr>
+      </w:pPr>
+      <w:r>
+        <w:rPr>
+          <w:lang w:val="es-ES"/>
+        </w:rPr>
+        <w:t xml:space="preserve">Entender </w:t>
+      </w:r>
+      <w:proofErr w:type="spellStart"/>
+      <w:r>
+        <w:rPr>
+          <w:lang w:val="es-ES"/>
+        </w:rPr>
+        <w:t>Teoria</w:t>
+      </w:r>
+      <w:proofErr w:type="spellEnd"/>
+      <w:r>
+        <w:rPr>
+          <w:lang w:val="es-ES"/>
+        </w:rPr>
+        <w:t xml:space="preserve"> del trabajo: LUNES</w:t>
+      </w:r>
+    </w:p>
+    <w:p>
+      <w:pPr>
+        <w:pStyle w:val="Prrafodelista"/>
+        <w:numPr>
+          <w:ilvl w:val="0"/>
+          <w:numId w:val="2"/>
+        </w:numPr>
+        <w:rPr>
+          <w:lang w:val="es-ES"/>
+        </w:rPr>
+      </w:pPr>
+      <w:r>
+        <w:rPr>
+          <w:lang w:val="es-ES"/>
+        </w:rPr>
+        <w:t xml:space="preserve">Repartimiento de trabajo para </w:t>
+      </w:r>
+      <w:proofErr w:type="gramStart"/>
+      <w:r>
+        <w:rPr>
+          <w:lang w:val="es-ES"/>
+        </w:rPr>
+        <w:t>las demás sprint</w:t>
+      </w:r>
+      <w:proofErr w:type="gramEnd"/>
+      <w:r>
+        <w:rPr>
+          <w:lang w:val="es-ES"/>
+        </w:rPr>
+        <w:t xml:space="preserve"> </w:t>
+      </w:r>
+    </w:p>
+    <w:p>
+      <w:pPr>
+        <w:rPr>
+          <w:lang w:val="es-ES"/>
+        </w:rPr>
+      </w:pPr>
+    </w:p>
+    <w:p>
+      <w:pPr>
+        <w:rPr>
+          <w:lang w:val="es-ES"/>
+        </w:rPr>
+      </w:pPr>
+    </w:p>
+    <w:p>
+      <w:pPr>
+        <w:rPr>
+          <w:lang w:val="es-ES"/>
+        </w:rPr>
+      </w:pPr>
+    </w:p>
+    <w:p>
+      <w:pPr>
+        <w:rPr>
+          <w:lang w:val="es-ES"/>
+        </w:rPr>
+      </w:pPr>
+    </w:p>
+    <w:p>
+      <w:pPr>
+        <w:rPr>
+          <w:lang w:val="es-ES"/>
+        </w:rPr>
+      </w:pPr>
+    </w:p>
+    <w:p>
+      <w:pPr>
+        <w:rPr>
+          <w:lang w:val="es-ES"/>
+        </w:rPr>
+      </w:pPr>
+    </w:p>
+    <w:p>
+      <w:pPr>
+        <w:rPr>
+          <w:lang w:val="es-ES"/>
+        </w:rPr>
+      </w:pPr>
+    </w:p>
+    <w:p>
+      <w:pPr>
+        <w:rPr>
+          <w:u w:val="single"/>
+          <w:lang w:val="es-ES"/>
+        </w:rPr>
+      </w:pPr>
+    </w:p>
+    <w:p>
+      <w:pPr>
+        <w:rPr>
+          <w:lang w:val="es-ES"/>
+        </w:rPr>
+      </w:pPr>
+      <w:r>
+        <w:rPr>
+          <w:lang w:val="es-ES"/>
+        </w:rPr>
+        <w:lastRenderedPageBreak/>
+        <w:t>ENTENDIMIENTO TEORICO</w:t>
+      </w:r>
+    </w:p>
+    <w:p>
+      <w:pPr>
+        <w:rPr>
+          <w:lang w:val="es-ES"/>
+        </w:rPr>
+      </w:pPr>
+    </w:p>
+    <w:p>
+      <w:pPr>
+        <w:rPr>
+          <w:lang w:val="es-ES"/>
+        </w:rPr>
+      </w:pPr>
+    </w:p>
+    <w:p>
+      <w:pPr>
+        <w:rPr>
+          <w:b/>
+          <w:bCs/>
+          <w:lang w:val="es-ES"/>
+        </w:rPr>
+      </w:pPr>
+      <w:r>
+        <w:rPr>
+          <w:b/>
+          <w:bCs/>
+          <w:lang w:val="es-ES"/>
+        </w:rPr>
+        <w:t>1. Deep Adversarial (Predicción de Patrones)</w:t>
+      </w:r>
+    </w:p>
+    <w:p>
+      <w:pPr>
+        <w:rPr>
+          <w:lang w:val="es-ES"/>
+        </w:rPr>
+      </w:pPr>
+      <w:r>
+        <w:rPr>
+          <w:lang w:val="es-ES"/>
+        </w:rPr>
+        <w:t xml:space="preserve">Este método se encarga exclusivamente de </w:t>
+      </w:r>
+      <w:r>
+        <w:rPr>
+          <w:b/>
+          <w:bCs/>
+          <w:lang w:val="es-ES"/>
+        </w:rPr>
+        <w:t>dibujar las líneas y bordes</w:t>
+      </w:r>
+      <w:r>
+        <w:rPr>
+          <w:lang w:val="es-ES"/>
+        </w:rPr>
+        <w:t xml:space="preserve"> de la cerámica que falta. Se basa en una Red Generativa Adversaria (GAN), que funciona enfrentando a dos redes neuronales: un </w:t>
+      </w:r>
+      <w:r>
+        <w:rPr>
+          <w:i/>
+          <w:iCs/>
+          <w:lang w:val="es-ES"/>
+        </w:rPr>
+        <w:t>Generador</w:t>
+      </w:r>
+      <w:r>
+        <w:rPr>
+          <w:lang w:val="es-ES"/>
+        </w:rPr>
+        <w:t xml:space="preserve"> (que intenta falsificar las líneas) y un </w:t>
+      </w:r>
+      <w:r>
+        <w:rPr>
+          <w:i/>
+          <w:iCs/>
+          <w:lang w:val="es-ES"/>
+        </w:rPr>
+        <w:t>Discriminador</w:t>
+      </w:r>
+      <w:r>
+        <w:rPr>
+          <w:lang w:val="es-ES"/>
+        </w:rPr>
+        <w:t xml:space="preserve"> (que intenta pillar al falsificador).</w:t>
+      </w:r>
+    </w:p>
+    <w:p>
+      <w:pPr>
+        <w:rPr>
+          <w:lang w:val="es-ES"/>
+        </w:rPr>
+      </w:pPr>
+      <w:r>
+        <w:rPr>
+          <w:lang w:val="es-ES"/>
+        </w:rPr>
+        <w:t>El artículo introduce dos mejoras matemáticas cruciales para evitar que la GAN falle:</w:t>
+      </w:r>
+    </w:p>
+    <w:p>
+      <w:pPr>
+        <w:rPr>
+          <w:lang w:val="es-ES"/>
+        </w:rPr>
+      </w:pPr>
+      <w:r>
+        <w:rPr>
+          <w:b/>
+          <w:bCs/>
+          <w:lang w:val="es-ES"/>
+        </w:rPr>
+        <w:t xml:space="preserve">A. La Extracción de Bordes (Canny Edge </w:t>
+      </w:r>
+      <w:proofErr w:type="spellStart"/>
+      <w:r>
+        <w:rPr>
+          <w:b/>
+          <w:bCs/>
+          <w:lang w:val="es-ES"/>
+        </w:rPr>
+        <w:t>Detection</w:t>
+      </w:r>
+      <w:proofErr w:type="spellEnd"/>
+      <w:r>
+        <w:rPr>
+          <w:b/>
+          <w:bCs/>
+          <w:lang w:val="es-ES"/>
+        </w:rPr>
+        <w:t>)</w:t>
+      </w:r>
+      <w:r>
+        <w:rPr>
+          <w:lang w:val="es-ES"/>
+        </w:rPr>
+        <w:t xml:space="preserve"> Antes de que la red empiece a predecir, necesita entender qué es una línea. Para ello, el algoritmo usa un detector de bordes de doble umbral adaptativo.</w:t>
+      </w:r>
+    </w:p>
+    <w:p>
+      <w:pPr>
+        <w:numPr>
+          <w:ilvl w:val="0"/>
+          <w:numId w:val="3"/>
+        </w:numPr>
+        <w:rPr>
+          <w:lang w:val="es-ES"/>
+        </w:rPr>
+      </w:pPr>
+      <w:r>
+        <w:rPr>
+          <w:lang w:val="es-ES"/>
+        </w:rPr>
+        <w:t>Primero, usa un filtro Gaussiano para suavizar la imagen y quitar el "ruido" (píxeles sueltos que no son dibujo).</w:t>
+      </w:r>
+    </w:p>
+    <w:p>
+      <w:pPr>
+        <w:numPr>
+          <w:ilvl w:val="0"/>
+          <w:numId w:val="3"/>
+        </w:numPr>
+        <w:rPr>
+          <w:lang w:val="es-ES"/>
+        </w:rPr>
+      </w:pPr>
+      <w:r>
+        <w:rPr>
+          <w:lang w:val="es-ES"/>
+        </w:rPr>
+        <w:t>Luego, calcula la amplitud y dirección del gradiente (los cambios bruscos de color que indican un borde) usando el operador de Sobel.</w:t>
+      </w:r>
+    </w:p>
+    <w:p>
+      <w:pPr>
+        <w:numPr>
+          <w:ilvl w:val="0"/>
+          <w:numId w:val="3"/>
+        </w:numPr>
+        <w:rPr>
+          <w:lang w:val="es-ES"/>
+        </w:rPr>
+      </w:pPr>
+      <w:r>
+        <w:rPr>
+          <w:lang w:val="es-ES"/>
+        </w:rPr>
+        <w:t>Finalmente, aplica una "supresión de no máximos" para quedarse solo con las líneas más finas y reales.</w:t>
+      </w:r>
+    </w:p>
+    <w:p>
+      <w:pPr>
+        <w:rPr>
+          <w:lang w:val="es-ES"/>
+        </w:rPr>
+      </w:pPr>
+      <w:r>
+        <w:rPr>
+          <w:b/>
+          <w:bCs/>
+          <w:lang w:val="es-ES"/>
+        </w:rPr>
+        <w:t>B. Solución al fallo 1: Normalización Espectral (</w:t>
+      </w:r>
+      <w:proofErr w:type="spellStart"/>
+      <w:r>
+        <w:rPr>
+          <w:b/>
+          <w:bCs/>
+          <w:lang w:val="es-ES"/>
+        </w:rPr>
+        <w:t>Spectral</w:t>
+      </w:r>
+      <w:proofErr w:type="spellEnd"/>
+      <w:r>
+        <w:rPr>
+          <w:b/>
+          <w:bCs/>
+          <w:lang w:val="es-ES"/>
+        </w:rPr>
+        <w:t xml:space="preserve"> </w:t>
+      </w:r>
+      <w:proofErr w:type="spellStart"/>
+      <w:r>
+        <w:rPr>
+          <w:b/>
+          <w:bCs/>
+          <w:lang w:val="es-ES"/>
+        </w:rPr>
+        <w:t>Normalization</w:t>
+      </w:r>
+      <w:proofErr w:type="spellEnd"/>
+      <w:r>
+        <w:rPr>
+          <w:b/>
+          <w:bCs/>
+          <w:lang w:val="es-ES"/>
+        </w:rPr>
+        <w:t>)</w:t>
+      </w:r>
+    </w:p>
+    <w:p>
+      <w:pPr>
+        <w:numPr>
+          <w:ilvl w:val="0"/>
+          <w:numId w:val="4"/>
+        </w:numPr>
+        <w:rPr>
+          <w:lang w:val="es-ES"/>
+        </w:rPr>
+      </w:pPr>
+      <w:r>
+        <w:rPr>
+          <w:i/>
+          <w:iCs/>
+          <w:lang w:val="es-ES"/>
+        </w:rPr>
+        <w:t>El problema:</w:t>
+      </w:r>
+      <w:r>
+        <w:rPr>
+          <w:lang w:val="es-ES"/>
+        </w:rPr>
+        <w:t xml:space="preserve"> Las GANs suelen sufrir un fallo llamado "desvanecimiento del gradiente". Esto ocurre cuando el Discriminador se vuelve demasiado bueno muy rápido, la distribución de los datos generados se superpone con los reales, y el Generador deja de aprender (el gradiente de la función matemática se vuelve cero).</w:t>
+      </w:r>
+    </w:p>
+    <w:p>
+      <w:pPr>
+        <w:numPr>
+          <w:ilvl w:val="0"/>
+          <w:numId w:val="4"/>
+        </w:numPr>
+        <w:rPr>
+          <w:lang w:val="es-ES"/>
+        </w:rPr>
+      </w:pPr>
+      <w:r>
+        <w:rPr>
+          <w:i/>
+          <w:iCs/>
+          <w:lang w:val="es-ES"/>
+        </w:rPr>
+        <w:t>La solución:</w:t>
+      </w:r>
+      <w:r>
+        <w:rPr>
+          <w:lang w:val="es-ES"/>
+        </w:rPr>
+        <w:t xml:space="preserve"> Los autores aplican una restricción matemática llamada </w:t>
+      </w:r>
+      <w:r>
+        <w:rPr>
+          <w:b/>
+          <w:bCs/>
+          <w:lang w:val="es-ES"/>
+        </w:rPr>
+        <w:t>"Continuidad de Lipschitz"</w:t>
+      </w:r>
+      <w:r>
+        <w:rPr>
+          <w:lang w:val="es-ES"/>
+        </w:rPr>
+        <w:t>. Básicamente, fuerzan a que la función matemática del Discriminador no crezca de forma brusca (limitan su pendiente máxima a 1). Esto lo consiguen dividiendo los parámetros de cada capa de la red neuronal por su norma espectral. Esto hace que el entrenamiento sea muchísimo más estable.</w:t>
+      </w:r>
+    </w:p>
+    <w:p>
+      <w:pPr>
+        <w:rPr>
+          <w:lang w:val="es-ES"/>
+        </w:rPr>
+      </w:pPr>
+      <w:r>
+        <w:rPr>
+          <w:b/>
+          <w:bCs/>
+          <w:lang w:val="es-ES"/>
+        </w:rPr>
+        <w:t>C. Solución al fallo 2: Local Patch Adversarial</w:t>
+      </w:r>
+    </w:p>
+    <w:p>
+      <w:pPr>
+        <w:numPr>
+          <w:ilvl w:val="0"/>
+          <w:numId w:val="5"/>
+        </w:numPr>
+        <w:rPr>
+          <w:lang w:val="es-ES"/>
+        </w:rPr>
+      </w:pPr>
+      <w:r>
+        <w:rPr>
+          <w:i/>
+          <w:iCs/>
+          <w:lang w:val="es-ES"/>
+        </w:rPr>
+        <w:t>El problema:</w:t>
+      </w:r>
+      <w:r>
+        <w:rPr>
+          <w:lang w:val="es-ES"/>
+        </w:rPr>
+        <w:t xml:space="preserve"> Si el Discriminador evalúa toda la imagen a la vez usando funciones de pérdida clásicas (L1 o L2), tiende a generar imágenes con patrones borrosos.</w:t>
+      </w:r>
+    </w:p>
+    <w:p>
+      <w:pPr>
+        <w:numPr>
+          <w:ilvl w:val="0"/>
+          <w:numId w:val="5"/>
+        </w:numPr>
+        <w:rPr>
+          <w:lang w:val="es-ES"/>
+        </w:rPr>
+      </w:pPr>
+      <w:r>
+        <w:rPr>
+          <w:i/>
+          <w:iCs/>
+          <w:lang w:val="es-ES"/>
+        </w:rPr>
+        <w:t>La solución:</w:t>
+      </w:r>
+      <w:r>
+        <w:rPr>
+          <w:lang w:val="es-ES"/>
+        </w:rPr>
+        <w:t xml:space="preserve"> En lugar de mirar el plato entero, el Discriminador se divide en una cuadrícula de pequeños "parches" (ej. 16x16 píxeles). La red evalúa si cada pequeño parche individual es falso o real y luego calcula la media de probabilidad de toda la imagen. Esto obliga al Generador a prestar atención a los detalles finos de alta frecuencia, logrando líneas súper nítidas.</w:t>
+      </w:r>
+    </w:p>
+    <w:p>
+      <w:pPr>
+        <w:rPr>
+          <w:lang w:val="es-ES"/>
+        </w:rPr>
+      </w:pPr>
+      <w:r>
+        <w:rPr>
+          <w:lang w:val="es-ES"/>
+        </w:rPr>
+        <w:pict w14:anchorId="5B825DDC">
+          <v:rect id="_x0000_i1031" style="width:0;height:1.5pt" o:hralign="center" o:hrstd="t" o:hr="t" fillcolor="#a0a0a0" stroked="f"/>
+        </w:pict>
+      </w:r>
+    </w:p>
+    <w:p>
+      <w:pPr>
+        <w:rPr>
+          <w:b/>
+          <w:bCs/>
+          <w:lang w:val="es-ES"/>
+        </w:rPr>
+      </w:pPr>
+      <w:r>
+        <w:rPr>
+          <w:b/>
+          <w:bCs/>
+          <w:lang w:val="es-ES"/>
+        </w:rPr>
+        <w:t xml:space="preserve">2. Reverse </w:t>
+      </w:r>
+      <w:proofErr w:type="spellStart"/>
+      <w:r>
+        <w:rPr>
+          <w:b/>
+          <w:bCs/>
+          <w:lang w:val="es-ES"/>
+        </w:rPr>
+        <w:t>Diffusion</w:t>
+      </w:r>
+      <w:proofErr w:type="spellEnd"/>
+      <w:r>
+        <w:rPr>
+          <w:b/>
+          <w:bCs/>
+          <w:lang w:val="es-ES"/>
+        </w:rPr>
+        <w:t xml:space="preserve"> (Predicción Complementaria)</w:t>
+      </w:r>
+    </w:p>
+    <w:p>
+      <w:pPr>
+        <w:rPr>
+          <w:lang w:val="es-ES"/>
+        </w:rPr>
+      </w:pPr>
+      <w:r>
+        <w:rPr>
+          <w:lang w:val="es-ES"/>
+        </w:rPr>
+        <w:t xml:space="preserve">Una vez que el "Deep Adversarial" ha dibujado el esqueleto de las líneas, entra en juego la "Difusión Inversa". Su trabajo es </w:t>
+      </w:r>
+      <w:r>
+        <w:rPr>
+          <w:b/>
+          <w:bCs/>
+          <w:lang w:val="es-ES"/>
+        </w:rPr>
+        <w:t>rellenar el color, el esmalte y la textura</w:t>
+      </w:r>
+      <w:r>
+        <w:rPr>
+          <w:lang w:val="es-ES"/>
+        </w:rPr>
+        <w:t xml:space="preserve"> basándose en esas líneas.</w:t>
+      </w:r>
+    </w:p>
+    <w:p>
+      <w:pPr>
+        <w:rPr>
+          <w:lang w:val="es-ES"/>
+        </w:rPr>
+      </w:pPr>
+      <w:r>
+        <w:rPr>
+          <w:lang w:val="es-ES"/>
+        </w:rPr>
+        <w:t xml:space="preserve">Los modelos de difusión son la tecnología detrás de IAs modernas como </w:t>
+      </w:r>
+      <w:proofErr w:type="spellStart"/>
+      <w:r>
+        <w:rPr>
+          <w:i/>
+          <w:iCs/>
+          <w:lang w:val="es-ES"/>
+        </w:rPr>
+        <w:t>Midjourney</w:t>
+      </w:r>
+      <w:proofErr w:type="spellEnd"/>
+      <w:r>
+        <w:rPr>
+          <w:lang w:val="es-ES"/>
+        </w:rPr>
+        <w:t xml:space="preserve"> o </w:t>
+      </w:r>
+      <w:r>
+        <w:rPr>
+          <w:i/>
+          <w:iCs/>
+          <w:lang w:val="es-ES"/>
+        </w:rPr>
+        <w:t>DALL-E</w:t>
+      </w:r>
+      <w:r>
+        <w:rPr>
+          <w:lang w:val="es-ES"/>
+        </w:rPr>
+        <w:t>. Se basan en la termodinámica y las Cadenas de Markov.</w:t>
+      </w:r>
+    </w:p>
+    <w:p>
+      <w:pPr>
+        <w:rPr>
+          <w:lang w:val="es-ES"/>
+        </w:rPr>
+      </w:pPr>
+      <w:r>
+        <w:rPr>
+          <w:b/>
+          <w:bCs/>
+          <w:lang w:val="es-ES"/>
+        </w:rPr>
+        <w:lastRenderedPageBreak/>
+        <w:t>A. El Proceso de Difusión (Cadenas de Markov)</w:t>
+      </w:r>
+    </w:p>
+    <w:p>
+      <w:pPr>
+        <w:rPr>
+          <w:lang w:val="es-ES"/>
+        </w:rPr>
+      </w:pPr>
+      <w:r>
+        <w:rPr>
+          <w:lang w:val="es-ES"/>
+        </w:rPr>
+        <w:t>El modelo funciona en dos fases opuestas:</w:t>
+      </w:r>
+    </w:p>
+    <w:p>
+      <w:pPr>
+        <w:numPr>
+          <w:ilvl w:val="0"/>
+          <w:numId w:val="6"/>
+        </w:numPr>
+        <w:rPr>
+          <w:lang w:val="es-ES"/>
+        </w:rPr>
+      </w:pPr>
+      <w:r>
+        <w:rPr>
+          <w:b/>
+          <w:bCs/>
+          <w:lang w:val="es-ES"/>
+        </w:rPr>
+        <w:t>Proceso Forward (Añadir ruido):</w:t>
+      </w:r>
+      <w:r>
+        <w:rPr>
+          <w:lang w:val="es-ES"/>
+        </w:rPr>
+        <w:t xml:space="preserve"> Durante el entrenamiento, el algoritmo coge una imagen perfecta de un plato y le va inyectando ruido gaussiano (píxeles aleatorios) paso a paso a lo largo de una Cadena de Markov (una secuencia donde cada paso solo depende del estado inmediatamente anterior). Repite esto $T$ veces hasta que la imagen original se destruye por completo y es solo "ruido estático" puro.</w:t>
+      </w:r>
+    </w:p>
+    <w:p>
+      <w:pPr>
+        <w:numPr>
+          <w:ilvl w:val="0"/>
+          <w:numId w:val="6"/>
+        </w:numPr>
+        <w:rPr>
+          <w:lang w:val="es-ES"/>
+        </w:rPr>
+      </w:pPr>
+      <w:r>
+        <w:rPr>
+          <w:b/>
+          <w:bCs/>
+          <w:lang w:val="es-ES"/>
+        </w:rPr>
+        <w:t>Proceso Reverse (Quitar ruido):</w:t>
+      </w:r>
+      <w:r>
+        <w:rPr>
+          <w:lang w:val="es-ES"/>
+        </w:rPr>
+        <w:t xml:space="preserve"> Aquí ocurre la magia. La IA aprende la probabilidad matemática de </w:t>
+      </w:r>
+      <w:r>
+        <w:rPr>
+          <w:i/>
+          <w:iCs/>
+          <w:lang w:val="es-ES"/>
+        </w:rPr>
+        <w:t>revertir</w:t>
+      </w:r>
+      <w:r>
+        <w:rPr>
+          <w:lang w:val="es-ES"/>
+        </w:rPr>
+        <w:t xml:space="preserve"> ese ruido paso a paso. A la hora de predecir vuestro plato roto, el modelo parte de ruido puro y, guiado por las líneas del dibujo que le pasa el modelo anterior, va quitando el ruido hasta que "aparece" el color azul y blanco perfecto.</w:t>
+      </w:r>
+    </w:p>
+    <w:p>
+      <w:pPr>
+        <w:rPr>
+          <w:lang w:val="es-ES"/>
+        </w:rPr>
+      </w:pPr>
+      <w:r>
+        <w:rPr>
+          <w:b/>
+          <w:bCs/>
+          <w:lang w:val="es-ES"/>
+        </w:rPr>
+        <w:t>B. La Arquitectura de Red (U-Net)</w:t>
+      </w:r>
+      <w:r>
+        <w:rPr>
+          <w:lang w:val="es-ES"/>
+        </w:rPr>
+        <w:t xml:space="preserve"> Para hacer esta limpieza de ruido, usan una red neuronal llamada </w:t>
+      </w:r>
+      <w:r>
+        <w:rPr>
+          <w:b/>
+          <w:bCs/>
+          <w:lang w:val="es-ES"/>
+        </w:rPr>
+        <w:t>U-Net</w:t>
+      </w:r>
+      <w:r>
+        <w:rPr>
+          <w:lang w:val="es-ES"/>
+        </w:rPr>
+        <w:t xml:space="preserve"> de 4 capas.</w:t>
+      </w:r>
+    </w:p>
+    <w:p>
+      <w:pPr>
+        <w:numPr>
+          <w:ilvl w:val="0"/>
+          <w:numId w:val="7"/>
+        </w:numPr>
+        <w:rPr>
+          <w:lang w:val="es-ES"/>
+        </w:rPr>
+      </w:pPr>
+      <w:r>
+        <w:rPr>
+          <w:lang w:val="es-ES"/>
+        </w:rPr>
+        <w:t>La imagen entra y se va reduciendo de tamaño (</w:t>
+      </w:r>
+      <w:proofErr w:type="spellStart"/>
+      <w:r>
+        <w:rPr>
+          <w:i/>
+          <w:iCs/>
+          <w:lang w:val="es-ES"/>
+        </w:rPr>
+        <w:t>down-sampling</w:t>
+      </w:r>
+      <w:proofErr w:type="spellEnd"/>
+      <w:r>
+        <w:rPr>
+          <w:lang w:val="es-ES"/>
+        </w:rPr>
+        <w:t xml:space="preserve"> usando </w:t>
+      </w:r>
+      <w:proofErr w:type="spellStart"/>
+      <w:r>
+        <w:rPr>
+          <w:i/>
+          <w:iCs/>
+          <w:lang w:val="es-ES"/>
+        </w:rPr>
+        <w:t>max</w:t>
+      </w:r>
+      <w:proofErr w:type="spellEnd"/>
+      <w:r>
+        <w:rPr>
+          <w:i/>
+          <w:iCs/>
+          <w:lang w:val="es-ES"/>
+        </w:rPr>
+        <w:t xml:space="preserve"> </w:t>
+      </w:r>
+      <w:proofErr w:type="spellStart"/>
+      <w:r>
+        <w:rPr>
+          <w:i/>
+          <w:iCs/>
+          <w:lang w:val="es-ES"/>
+        </w:rPr>
+        <w:t>pooling</w:t>
+      </w:r>
+      <w:proofErr w:type="spellEnd"/>
+      <w:r>
+        <w:rPr>
+          <w:lang w:val="es-ES"/>
+        </w:rPr>
+        <w:t>) para extraer las características más abstractas (el concepto de "qué es un pétalo azul").</w:t>
+      </w:r>
+    </w:p>
+    <w:p>
+      <w:pPr>
+        <w:numPr>
+          <w:ilvl w:val="0"/>
+          <w:numId w:val="7"/>
+        </w:numPr>
+        <w:rPr>
+          <w:lang w:val="es-ES"/>
+        </w:rPr>
+      </w:pPr>
+      <w:r>
+        <w:rPr>
+          <w:lang w:val="es-ES"/>
+        </w:rPr>
+        <w:t>Luego se vuelve a ampliar (</w:t>
+      </w:r>
+      <w:r>
+        <w:rPr>
+          <w:i/>
+          <w:iCs/>
+          <w:lang w:val="es-ES"/>
+        </w:rPr>
+        <w:t>up-</w:t>
+      </w:r>
+      <w:proofErr w:type="spellStart"/>
+      <w:r>
+        <w:rPr>
+          <w:i/>
+          <w:iCs/>
+          <w:lang w:val="es-ES"/>
+        </w:rPr>
+        <w:t>sampling</w:t>
+      </w:r>
+      <w:proofErr w:type="spellEnd"/>
+      <w:r>
+        <w:rPr>
+          <w:lang w:val="es-ES"/>
+        </w:rPr>
+        <w:t xml:space="preserve"> usando </w:t>
+      </w:r>
+      <w:r>
+        <w:rPr>
+          <w:i/>
+          <w:iCs/>
+          <w:lang w:val="es-ES"/>
+        </w:rPr>
+        <w:t xml:space="preserve">inverse </w:t>
+      </w:r>
+      <w:proofErr w:type="spellStart"/>
+      <w:r>
+        <w:rPr>
+          <w:i/>
+          <w:iCs/>
+          <w:lang w:val="es-ES"/>
+        </w:rPr>
+        <w:t>convolution</w:t>
+      </w:r>
+      <w:proofErr w:type="spellEnd"/>
+      <w:r>
+        <w:rPr>
+          <w:lang w:val="es-ES"/>
+        </w:rPr>
+        <w:t>) para recuperar el tamaño original de la imagen.</w:t>
+      </w:r>
+    </w:p>
+    <w:p>
+      <w:pPr>
+        <w:rPr>
+          <w:lang w:val="es-ES"/>
+        </w:rPr>
+      </w:pPr>
+      <w:r>
+        <w:rPr>
+          <w:b/>
+          <w:bCs/>
+          <w:lang w:val="es-ES"/>
+        </w:rPr>
+        <w:t xml:space="preserve">C. El "Shift Window </w:t>
+      </w:r>
+      <w:proofErr w:type="spellStart"/>
+      <w:r>
+        <w:rPr>
+          <w:b/>
+          <w:bCs/>
+          <w:lang w:val="es-ES"/>
+        </w:rPr>
+        <w:t>Transformer</w:t>
+      </w:r>
+      <w:proofErr w:type="spellEnd"/>
+      <w:r>
+        <w:rPr>
+          <w:b/>
+          <w:bCs/>
+          <w:lang w:val="es-ES"/>
+        </w:rPr>
+        <w:t>" (La gran optimización)</w:t>
+      </w:r>
+    </w:p>
+    <w:p>
+      <w:pPr>
+        <w:numPr>
+          <w:ilvl w:val="0"/>
+          <w:numId w:val="8"/>
+        </w:numPr>
+        <w:rPr>
+          <w:lang w:val="es-ES"/>
+        </w:rPr>
+      </w:pPr>
+      <w:r>
+        <w:rPr>
+          <w:i/>
+          <w:iCs/>
+          <w:lang w:val="es-ES"/>
+        </w:rPr>
+        <w:t>El problema:</w:t>
+      </w:r>
+      <w:r>
+        <w:rPr>
+          <w:lang w:val="es-ES"/>
+        </w:rPr>
+        <w:t xml:space="preserve"> Rellenar color en imágenes de alta resolución exige muchísima memoria RAM gráfica si la IA tiene que relacionar cada píxel con todos los demás a la vez (lo que hacen los </w:t>
+      </w:r>
+      <w:r>
+        <w:rPr>
+          <w:i/>
+          <w:iCs/>
+          <w:lang w:val="es-ES"/>
+        </w:rPr>
+        <w:t>Transformers</w:t>
+      </w:r>
+      <w:r>
+        <w:rPr>
+          <w:lang w:val="es-ES"/>
+        </w:rPr>
+        <w:t xml:space="preserve"> convencionales).</w:t>
+      </w:r>
+    </w:p>
+    <w:p>
+      <w:pPr>
+        <w:numPr>
+          <w:ilvl w:val="0"/>
+          <w:numId w:val="8"/>
+        </w:numPr>
+        <w:rPr>
+          <w:lang w:val="es-ES"/>
+        </w:rPr>
+      </w:pPr>
+      <w:r>
+        <w:rPr>
+          <w:i/>
+          <w:iCs/>
+          <w:lang w:val="es-ES"/>
+        </w:rPr>
+        <w:t>La solución:</w:t>
+      </w:r>
+      <w:r>
+        <w:rPr>
+          <w:lang w:val="es-ES"/>
+        </w:rPr>
+        <w:t xml:space="preserve"> Implementan un mecanismo de "ventanas desplazadas" (</w:t>
+      </w:r>
+      <w:r>
+        <w:rPr>
+          <w:i/>
+          <w:iCs/>
+          <w:lang w:val="es-ES"/>
+        </w:rPr>
+        <w:t>Shift Window</w:t>
+      </w:r>
+      <w:r>
+        <w:rPr>
+          <w:lang w:val="es-ES"/>
+        </w:rPr>
+        <w:t>). El algoritmo divide la imagen en ventanas locales y solo procesa la atención dentro de esa ventana, lo que reduce drásticamente el coste computacional. Para que las ventanas no queden aisladas, en la siguiente capa las ventanas "se desplazan", solapándose con las anteriores para permitir que la información global del plato se intercambie de un lado a otro de la imagen.</w:t>
+      </w:r>
+    </w:p>
+    <w:p>
+      <w:pPr>
+        <w:rPr>
+          <w:lang w:val="es-ES"/>
+        </w:rPr>
+      </w:pPr>
+    </w:p>
+    <w:p>
+      <w:pPr>
+        <w:rPr>
+          <w:lang w:val="es-ES"/>
+        </w:rPr>
+      </w:pPr>
     </w:p>
     <w:p>
       <w:pPr>
@@ -589,6 +1684,453 @@
     </w:lvl>
   </w:abstractNum>
   <w:abstractNum w:abstractNumId="1" w15:restartNumberingAfterBreak="0">
+    <w:nsid w:val="21FA1A13"/>
+    <w:multiLevelType w:val="multilevel"/>
+    <w:tmpl w:val="E9B2D766"/>
+    <w:lvl w:ilvl="0">
+      <w:start w:val="1"/>
+      <w:numFmt w:val="bullet"/>
+      <w:lvlText w:val=""/>
+      <w:lvlJc w:val="left"/>
+      <w:pPr>
+        <w:tabs>
+          <w:tab w:val="num" w:pos="720"/>
+        </w:tabs>
+        <w:ind w:left="720" w:hanging="360"/>
+      </w:pPr>
+      <w:rPr>
+        <w:rFonts w:ascii="Symbol" w:hAnsi="Symbol" w:hint="default"/>
+        <w:sz w:val="20"/>
+      </w:rPr>
+    </w:lvl>
+    <w:lvl w:ilvl="1" w:tentative="1">
+      <w:start w:val="1"/>
+      <w:numFmt w:val="bullet"/>
+      <w:lvlText w:val="o"/>
+      <w:lvlJc w:val="left"/>
+      <w:pPr>
+        <w:tabs>
+          <w:tab w:val="num" w:pos="1440"/>
+        </w:tabs>
+        <w:ind w:left="1440" w:hanging="360"/>
+      </w:pPr>
+      <w:rPr>
+        <w:rFonts w:ascii="Courier New" w:hAnsi="Courier New" w:hint="default"/>
+        <w:sz w:val="20"/>
+      </w:rPr>
+    </w:lvl>
+    <w:lvl w:ilvl="2" w:tentative="1">
+      <w:start w:val="1"/>
+      <w:numFmt w:val="bullet"/>
+      <w:lvlText w:val=""/>
+      <w:lvlJc w:val="left"/>
+      <w:pPr>
+        <w:tabs>
+          <w:tab w:val="num" w:pos="2160"/>
+        </w:tabs>
+        <w:ind w:left="2160" w:hanging="360"/>
+      </w:pPr>
+      <w:rPr>
+        <w:rFonts w:ascii="Wingdings" w:hAnsi="Wingdings" w:hint="default"/>
+        <w:sz w:val="20"/>
+      </w:rPr>
+    </w:lvl>
+    <w:lvl w:ilvl="3" w:tentative="1">
+      <w:start w:val="1"/>
+      <w:numFmt w:val="bullet"/>
+      <w:lvlText w:val=""/>
+      <w:lvlJc w:val="left"/>
+      <w:pPr>
+        <w:tabs>
+          <w:tab w:val="num" w:pos="2880"/>
+        </w:tabs>
+        <w:ind w:left="2880" w:hanging="360"/>
+      </w:pPr>
+      <w:rPr>
+        <w:rFonts w:ascii="Wingdings" w:hAnsi="Wingdings" w:hint="default"/>
+        <w:sz w:val="20"/>
+      </w:rPr>
+    </w:lvl>
+    <w:lvl w:ilvl="4" w:tentative="1">
+      <w:start w:val="1"/>
+      <w:numFmt w:val="bullet"/>
+      <w:lvlText w:val=""/>
+      <w:lvlJc w:val="left"/>
+      <w:pPr>
+        <w:tabs>
+          <w:tab w:val="num" w:pos="3600"/>
+        </w:tabs>
+        <w:ind w:left="3600" w:hanging="360"/>
+      </w:pPr>
+      <w:rPr>
+        <w:rFonts w:ascii="Wingdings" w:hAnsi="Wingdings" w:hint="default"/>
+        <w:sz w:val="20"/>
+      </w:rPr>
+    </w:lvl>
+    <w:lvl w:ilvl="5" w:tentative="1">
+      <w:start w:val="1"/>
+      <w:numFmt w:val="bullet"/>
+      <w:lvlText w:val=""/>
+      <w:lvlJc w:val="left"/>
+      <w:pPr>
+        <w:tabs>
+          <w:tab w:val="num" w:pos="4320"/>
+        </w:tabs>
+        <w:ind w:left="4320" w:hanging="360"/>
+      </w:pPr>
+      <w:rPr>
+        <w:rFonts w:ascii="Wingdings" w:hAnsi="Wingdings" w:hint="default"/>
+        <w:sz w:val="20"/>
+      </w:rPr>
+    </w:lvl>
+    <w:lvl w:ilvl="6" w:tentative="1">
+      <w:start w:val="1"/>
+      <w:numFmt w:val="bullet"/>
+      <w:lvlText w:val=""/>
+      <w:lvlJc w:val="left"/>
+      <w:pPr>
+        <w:tabs>
+          <w:tab w:val="num" w:pos="5040"/>
+        </w:tabs>
+        <w:ind w:left="5040" w:hanging="360"/>
+      </w:pPr>
+      <w:rPr>
+        <w:rFonts w:ascii="Wingdings" w:hAnsi="Wingdings" w:hint="default"/>
+        <w:sz w:val="20"/>
+      </w:rPr>
+    </w:lvl>
+    <w:lvl w:ilvl="7" w:tentative="1">
+      <w:start w:val="1"/>
+      <w:numFmt w:val="bullet"/>
+      <w:lvlText w:val=""/>
+      <w:lvlJc w:val="left"/>
+      <w:pPr>
+        <w:tabs>
+          <w:tab w:val="num" w:pos="5760"/>
+        </w:tabs>
+        <w:ind w:left="5760" w:hanging="360"/>
+      </w:pPr>
+      <w:rPr>
+        <w:rFonts w:ascii="Wingdings" w:hAnsi="Wingdings" w:hint="default"/>
+        <w:sz w:val="20"/>
+      </w:rPr>
+    </w:lvl>
+    <w:lvl w:ilvl="8" w:tentative="1">
+      <w:start w:val="1"/>
+      <w:numFmt w:val="bullet"/>
+      <w:lvlText w:val=""/>
+      <w:lvlJc w:val="left"/>
+      <w:pPr>
+        <w:tabs>
+          <w:tab w:val="num" w:pos="6480"/>
+        </w:tabs>
+        <w:ind w:left="6480" w:hanging="360"/>
+      </w:pPr>
+      <w:rPr>
+        <w:rFonts w:ascii="Wingdings" w:hAnsi="Wingdings" w:hint="default"/>
+        <w:sz w:val="20"/>
+      </w:rPr>
+    </w:lvl>
+  </w:abstractNum>
+  <w:abstractNum w:abstractNumId="2" w15:restartNumberingAfterBreak="0">
+    <w:nsid w:val="38FC60F1"/>
+    <w:multiLevelType w:val="multilevel"/>
+    <w:tmpl w:val="B5C826B4"/>
+    <w:lvl w:ilvl="0">
+      <w:start w:val="1"/>
+      <w:numFmt w:val="bullet"/>
+      <w:lvlText w:val=""/>
+      <w:lvlJc w:val="left"/>
+      <w:pPr>
+        <w:tabs>
+          <w:tab w:val="num" w:pos="720"/>
+        </w:tabs>
+        <w:ind w:left="720" w:hanging="360"/>
+      </w:pPr>
+      <w:rPr>
+        <w:rFonts w:ascii="Symbol" w:hAnsi="Symbol" w:hint="default"/>
+        <w:sz w:val="20"/>
+      </w:rPr>
+    </w:lvl>
+    <w:lvl w:ilvl="1" w:tentative="1">
+      <w:start w:val="1"/>
+      <w:numFmt w:val="bullet"/>
+      <w:lvlText w:val="o"/>
+      <w:lvlJc w:val="left"/>
+      <w:pPr>
+        <w:tabs>
+          <w:tab w:val="num" w:pos="1440"/>
+        </w:tabs>
+        <w:ind w:left="1440" w:hanging="360"/>
+      </w:pPr>
+      <w:rPr>
+        <w:rFonts w:ascii="Courier New" w:hAnsi="Courier New" w:hint="default"/>
+        <w:sz w:val="20"/>
+      </w:rPr>
+    </w:lvl>
+    <w:lvl w:ilvl="2" w:tentative="1">
+      <w:start w:val="1"/>
+      <w:numFmt w:val="bullet"/>
+      <w:lvlText w:val=""/>
+      <w:lvlJc w:val="left"/>
+      <w:pPr>
+        <w:tabs>
+          <w:tab w:val="num" w:pos="2160"/>
+        </w:tabs>
+        <w:ind w:left="2160" w:hanging="360"/>
+      </w:pPr>
+      <w:rPr>
+        <w:rFonts w:ascii="Wingdings" w:hAnsi="Wingdings" w:hint="default"/>
+        <w:sz w:val="20"/>
+      </w:rPr>
+    </w:lvl>
+    <w:lvl w:ilvl="3" w:tentative="1">
+      <w:start w:val="1"/>
+      <w:numFmt w:val="bullet"/>
+      <w:lvlText w:val=""/>
+      <w:lvlJc w:val="left"/>
+      <w:pPr>
+        <w:tabs>
+          <w:tab w:val="num" w:pos="2880"/>
+        </w:tabs>
+        <w:ind w:left="2880" w:hanging="360"/>
+      </w:pPr>
+      <w:rPr>
+        <w:rFonts w:ascii="Wingdings" w:hAnsi="Wingdings" w:hint="default"/>
+        <w:sz w:val="20"/>
+      </w:rPr>
+    </w:lvl>
+    <w:lvl w:ilvl="4" w:tentative="1">
+      <w:start w:val="1"/>
+      <w:numFmt w:val="bullet"/>
+      <w:lvlText w:val=""/>
+      <w:lvlJc w:val="left"/>
+      <w:pPr>
+        <w:tabs>
+          <w:tab w:val="num" w:pos="3600"/>
+        </w:tabs>
+        <w:ind w:left="3600" w:hanging="360"/>
+      </w:pPr>
+      <w:rPr>
+        <w:rFonts w:ascii="Wingdings" w:hAnsi="Wingdings" w:hint="default"/>
+        <w:sz w:val="20"/>
+      </w:rPr>
+    </w:lvl>
+    <w:lvl w:ilvl="5" w:tentative="1">
+      <w:start w:val="1"/>
+      <w:numFmt w:val="bullet"/>
+      <w:lvlText w:val=""/>
+      <w:lvlJc w:val="left"/>
+      <w:pPr>
+        <w:tabs>
+          <w:tab w:val="num" w:pos="4320"/>
+        </w:tabs>
+        <w:ind w:left="4320" w:hanging="360"/>
+      </w:pPr>
+      <w:rPr>
+        <w:rFonts w:ascii="Wingdings" w:hAnsi="Wingdings" w:hint="default"/>
+        <w:sz w:val="20"/>
+      </w:rPr>
+    </w:lvl>
+    <w:lvl w:ilvl="6" w:tentative="1">
+      <w:start w:val="1"/>
+      <w:numFmt w:val="bullet"/>
+      <w:lvlText w:val=""/>
+      <w:lvlJc w:val="left"/>
+      <w:pPr>
+        <w:tabs>
+          <w:tab w:val="num" w:pos="5040"/>
+        </w:tabs>
+        <w:ind w:left="5040" w:hanging="360"/>
+      </w:pPr>
+      <w:rPr>
+        <w:rFonts w:ascii="Wingdings" w:hAnsi="Wingdings" w:hint="default"/>
+        <w:sz w:val="20"/>
+      </w:rPr>
+    </w:lvl>
+    <w:lvl w:ilvl="7" w:tentative="1">
+      <w:start w:val="1"/>
+      <w:numFmt w:val="bullet"/>
+      <w:lvlText w:val=""/>
+      <w:lvlJc w:val="left"/>
+      <w:pPr>
+        <w:tabs>
+          <w:tab w:val="num" w:pos="5760"/>
+        </w:tabs>
+        <w:ind w:left="5760" w:hanging="360"/>
+      </w:pPr>
+      <w:rPr>
+        <w:rFonts w:ascii="Wingdings" w:hAnsi="Wingdings" w:hint="default"/>
+        <w:sz w:val="20"/>
+      </w:rPr>
+    </w:lvl>
+    <w:lvl w:ilvl="8" w:tentative="1">
+      <w:start w:val="1"/>
+      <w:numFmt w:val="bullet"/>
+      <w:lvlText w:val=""/>
+      <w:lvlJc w:val="left"/>
+      <w:pPr>
+        <w:tabs>
+          <w:tab w:val="num" w:pos="6480"/>
+        </w:tabs>
+        <w:ind w:left="6480" w:hanging="360"/>
+      </w:pPr>
+      <w:rPr>
+        <w:rFonts w:ascii="Wingdings" w:hAnsi="Wingdings" w:hint="default"/>
+        <w:sz w:val="20"/>
+      </w:rPr>
+    </w:lvl>
+  </w:abstractNum>
+  <w:abstractNum w:abstractNumId="3" w15:restartNumberingAfterBreak="0">
+    <w:nsid w:val="40F117F3"/>
+    <w:multiLevelType w:val="multilevel"/>
+    <w:tmpl w:val="F1EA3554"/>
+    <w:lvl w:ilvl="0">
+      <w:start w:val="1"/>
+      <w:numFmt w:val="bullet"/>
+      <w:lvlText w:val=""/>
+      <w:lvlJc w:val="left"/>
+      <w:pPr>
+        <w:tabs>
+          <w:tab w:val="num" w:pos="720"/>
+        </w:tabs>
+        <w:ind w:left="720" w:hanging="360"/>
+      </w:pPr>
+      <w:rPr>
+        <w:rFonts w:ascii="Symbol" w:hAnsi="Symbol" w:hint="default"/>
+        <w:sz w:val="20"/>
+      </w:rPr>
+    </w:lvl>
+    <w:lvl w:ilvl="1" w:tentative="1">
+      <w:start w:val="1"/>
+      <w:numFmt w:val="bullet"/>
+      <w:lvlText w:val="o"/>
+      <w:lvlJc w:val="left"/>
+      <w:pPr>
+        <w:tabs>
+          <w:tab w:val="num" w:pos="1440"/>
+        </w:tabs>
+        <w:ind w:left="1440" w:hanging="360"/>
+      </w:pPr>
+      <w:rPr>
+        <w:rFonts w:ascii="Courier New" w:hAnsi="Courier New" w:hint="default"/>
+        <w:sz w:val="20"/>
+      </w:rPr>
+    </w:lvl>
+    <w:lvl w:ilvl="2" w:tentative="1">
+      <w:start w:val="1"/>
+      <w:numFmt w:val="bullet"/>
+      <w:lvlText w:val=""/>
+      <w:lvlJc w:val="left"/>
+      <w:pPr>
+        <w:tabs>
+          <w:tab w:val="num" w:pos="2160"/>
+        </w:tabs>
+        <w:ind w:left="2160" w:hanging="360"/>
+      </w:pPr>
+      <w:rPr>
+        <w:rFonts w:ascii="Wingdings" w:hAnsi="Wingdings" w:hint="default"/>
+        <w:sz w:val="20"/>
+      </w:rPr>
+    </w:lvl>
+    <w:lvl w:ilvl="3" w:tentative="1">
+      <w:start w:val="1"/>
+      <w:numFmt w:val="bullet"/>
+      <w:lvlText w:val=""/>
+      <w:lvlJc w:val="left"/>
+      <w:pPr>
+        <w:tabs>
+          <w:tab w:val="num" w:pos="2880"/>
+        </w:tabs>
+        <w:ind w:left="2880" w:hanging="360"/>
+      </w:pPr>
+      <w:rPr>
+        <w:rFonts w:ascii="Wingdings" w:hAnsi="Wingdings" w:hint="default"/>
+        <w:sz w:val="20"/>
+      </w:rPr>
+    </w:lvl>
+    <w:lvl w:ilvl="4" w:tentative="1">
+      <w:start w:val="1"/>
+      <w:numFmt w:val="bullet"/>
+      <w:lvlText w:val=""/>
+      <w:lvlJc w:val="left"/>
+      <w:pPr>
+        <w:tabs>
+          <w:tab w:val="num" w:pos="3600"/>
+        </w:tabs>
+        <w:ind w:left="3600" w:hanging="360"/>
+      </w:pPr>
+      <w:rPr>
+        <w:rFonts w:ascii="Wingdings" w:hAnsi="Wingdings" w:hint="default"/>
+        <w:sz w:val="20"/>
+      </w:rPr>
+    </w:lvl>
+    <w:lvl w:ilvl="5" w:tentative="1">
+      <w:start w:val="1"/>
+      <w:numFmt w:val="bullet"/>
+      <w:lvlText w:val=""/>
+      <w:lvlJc w:val="left"/>
+      <w:pPr>
+        <w:tabs>
+          <w:tab w:val="num" w:pos="4320"/>
+        </w:tabs>
+        <w:ind w:left="4320" w:hanging="360"/>
+      </w:pPr>
+      <w:rPr>
+        <w:rFonts w:ascii="Wingdings" w:hAnsi="Wingdings" w:hint="default"/>
+        <w:sz w:val="20"/>
+      </w:rPr>
+    </w:lvl>
+    <w:lvl w:ilvl="6" w:tentative="1">
+      <w:start w:val="1"/>
+      <w:numFmt w:val="bullet"/>
+      <w:lvlText w:val=""/>
+      <w:lvlJc w:val="left"/>
+      <w:pPr>
+        <w:tabs>
+          <w:tab w:val="num" w:pos="5040"/>
+        </w:tabs>
+        <w:ind w:left="5040" w:hanging="360"/>
+      </w:pPr>
+      <w:rPr>
+        <w:rFonts w:ascii="Wingdings" w:hAnsi="Wingdings" w:hint="default"/>
+        <w:sz w:val="20"/>
+      </w:rPr>
+    </w:lvl>
+    <w:lvl w:ilvl="7" w:tentative="1">
+      <w:start w:val="1"/>
+      <w:numFmt w:val="bullet"/>
+      <w:lvlText w:val=""/>
+      <w:lvlJc w:val="left"/>
+      <w:pPr>
+        <w:tabs>
+          <w:tab w:val="num" w:pos="5760"/>
+        </w:tabs>
+        <w:ind w:left="5760" w:hanging="360"/>
+      </w:pPr>
+      <w:rPr>
+        <w:rFonts w:ascii="Wingdings" w:hAnsi="Wingdings" w:hint="default"/>
+        <w:sz w:val="20"/>
+      </w:rPr>
+    </w:lvl>
+    <w:lvl w:ilvl="8" w:tentative="1">
+      <w:start w:val="1"/>
+      <w:numFmt w:val="bullet"/>
+      <w:lvlText w:val=""/>
+      <w:lvlJc w:val="left"/>
+      <w:pPr>
+        <w:tabs>
+          <w:tab w:val="num" w:pos="6480"/>
+        </w:tabs>
+        <w:ind w:left="6480" w:hanging="360"/>
+      </w:pPr>
+      <w:rPr>
+        <w:rFonts w:ascii="Wingdings" w:hAnsi="Wingdings" w:hint="default"/>
+        <w:sz w:val="20"/>
+      </w:rPr>
+    </w:lvl>
+  </w:abstractNum>
+  <w:abstractNum w:abstractNumId="4" w15:restartNumberingAfterBreak="0">
     <w:nsid w:val="52217FEC"/>
     <w:multiLevelType w:val="hybridMultilevel"/>
     <w:tmpl w:val="269ED5C8"/>
@@ -697,6 +2239,453 @@
       </w:pPr>
       <w:rPr>
         <w:rFonts w:ascii="Wingdings" w:hAnsi="Wingdings" w:hint="default"/>
+      </w:rPr>
+    </w:lvl>
+  </w:abstractNum>
+  <w:abstractNum w:abstractNumId="5" w15:restartNumberingAfterBreak="0">
+    <w:nsid w:val="558B703F"/>
+    <w:multiLevelType w:val="multilevel"/>
+    <w:tmpl w:val="E4D8D888"/>
+    <w:lvl w:ilvl="0">
+      <w:start w:val="1"/>
+      <w:numFmt w:val="bullet"/>
+      <w:lvlText w:val=""/>
+      <w:lvlJc w:val="left"/>
+      <w:pPr>
+        <w:tabs>
+          <w:tab w:val="num" w:pos="720"/>
+        </w:tabs>
+        <w:ind w:left="720" w:hanging="360"/>
+      </w:pPr>
+      <w:rPr>
+        <w:rFonts w:ascii="Symbol" w:hAnsi="Symbol" w:hint="default"/>
+        <w:sz w:val="20"/>
+      </w:rPr>
+    </w:lvl>
+    <w:lvl w:ilvl="1" w:tentative="1">
+      <w:start w:val="1"/>
+      <w:numFmt w:val="bullet"/>
+      <w:lvlText w:val="o"/>
+      <w:lvlJc w:val="left"/>
+      <w:pPr>
+        <w:tabs>
+          <w:tab w:val="num" w:pos="1440"/>
+        </w:tabs>
+        <w:ind w:left="1440" w:hanging="360"/>
+      </w:pPr>
+      <w:rPr>
+        <w:rFonts w:ascii="Courier New" w:hAnsi="Courier New" w:hint="default"/>
+        <w:sz w:val="20"/>
+      </w:rPr>
+    </w:lvl>
+    <w:lvl w:ilvl="2" w:tentative="1">
+      <w:start w:val="1"/>
+      <w:numFmt w:val="bullet"/>
+      <w:lvlText w:val=""/>
+      <w:lvlJc w:val="left"/>
+      <w:pPr>
+        <w:tabs>
+          <w:tab w:val="num" w:pos="2160"/>
+        </w:tabs>
+        <w:ind w:left="2160" w:hanging="360"/>
+      </w:pPr>
+      <w:rPr>
+        <w:rFonts w:ascii="Wingdings" w:hAnsi="Wingdings" w:hint="default"/>
+        <w:sz w:val="20"/>
+      </w:rPr>
+    </w:lvl>
+    <w:lvl w:ilvl="3" w:tentative="1">
+      <w:start w:val="1"/>
+      <w:numFmt w:val="bullet"/>
+      <w:lvlText w:val=""/>
+      <w:lvlJc w:val="left"/>
+      <w:pPr>
+        <w:tabs>
+          <w:tab w:val="num" w:pos="2880"/>
+        </w:tabs>
+        <w:ind w:left="2880" w:hanging="360"/>
+      </w:pPr>
+      <w:rPr>
+        <w:rFonts w:ascii="Wingdings" w:hAnsi="Wingdings" w:hint="default"/>
+        <w:sz w:val="20"/>
+      </w:rPr>
+    </w:lvl>
+    <w:lvl w:ilvl="4" w:tentative="1">
+      <w:start w:val="1"/>
+      <w:numFmt w:val="bullet"/>
+      <w:lvlText w:val=""/>
+      <w:lvlJc w:val="left"/>
+      <w:pPr>
+        <w:tabs>
+          <w:tab w:val="num" w:pos="3600"/>
+        </w:tabs>
+        <w:ind w:left="3600" w:hanging="360"/>
+      </w:pPr>
+      <w:rPr>
+        <w:rFonts w:ascii="Wingdings" w:hAnsi="Wingdings" w:hint="default"/>
+        <w:sz w:val="20"/>
+      </w:rPr>
+    </w:lvl>
+    <w:lvl w:ilvl="5" w:tentative="1">
+      <w:start w:val="1"/>
+      <w:numFmt w:val="bullet"/>
+      <w:lvlText w:val=""/>
+      <w:lvlJc w:val="left"/>
+      <w:pPr>
+        <w:tabs>
+          <w:tab w:val="num" w:pos="4320"/>
+        </w:tabs>
+        <w:ind w:left="4320" w:hanging="360"/>
+      </w:pPr>
+      <w:rPr>
+        <w:rFonts w:ascii="Wingdings" w:hAnsi="Wingdings" w:hint="default"/>
+        <w:sz w:val="20"/>
+      </w:rPr>
+    </w:lvl>
+    <w:lvl w:ilvl="6" w:tentative="1">
+      <w:start w:val="1"/>
+      <w:numFmt w:val="bullet"/>
+      <w:lvlText w:val=""/>
+      <w:lvlJc w:val="left"/>
+      <w:pPr>
+        <w:tabs>
+          <w:tab w:val="num" w:pos="5040"/>
+        </w:tabs>
+        <w:ind w:left="5040" w:hanging="360"/>
+      </w:pPr>
+      <w:rPr>
+        <w:rFonts w:ascii="Wingdings" w:hAnsi="Wingdings" w:hint="default"/>
+        <w:sz w:val="20"/>
+      </w:rPr>
+    </w:lvl>
+    <w:lvl w:ilvl="7" w:tentative="1">
+      <w:start w:val="1"/>
+      <w:numFmt w:val="bullet"/>
+      <w:lvlText w:val=""/>
+      <w:lvlJc w:val="left"/>
+      <w:pPr>
+        <w:tabs>
+          <w:tab w:val="num" w:pos="5760"/>
+        </w:tabs>
+        <w:ind w:left="5760" w:hanging="360"/>
+      </w:pPr>
+      <w:rPr>
+        <w:rFonts w:ascii="Wingdings" w:hAnsi="Wingdings" w:hint="default"/>
+        <w:sz w:val="20"/>
+      </w:rPr>
+    </w:lvl>
+    <w:lvl w:ilvl="8" w:tentative="1">
+      <w:start w:val="1"/>
+      <w:numFmt w:val="bullet"/>
+      <w:lvlText w:val=""/>
+      <w:lvlJc w:val="left"/>
+      <w:pPr>
+        <w:tabs>
+          <w:tab w:val="num" w:pos="6480"/>
+        </w:tabs>
+        <w:ind w:left="6480" w:hanging="360"/>
+      </w:pPr>
+      <w:rPr>
+        <w:rFonts w:ascii="Wingdings" w:hAnsi="Wingdings" w:hint="default"/>
+        <w:sz w:val="20"/>
+      </w:rPr>
+    </w:lvl>
+  </w:abstractNum>
+  <w:abstractNum w:abstractNumId="6" w15:restartNumberingAfterBreak="0">
+    <w:nsid w:val="63922E02"/>
+    <w:multiLevelType w:val="multilevel"/>
+    <w:tmpl w:val="61009FD4"/>
+    <w:lvl w:ilvl="0">
+      <w:start w:val="1"/>
+      <w:numFmt w:val="bullet"/>
+      <w:lvlText w:val=""/>
+      <w:lvlJc w:val="left"/>
+      <w:pPr>
+        <w:tabs>
+          <w:tab w:val="num" w:pos="720"/>
+        </w:tabs>
+        <w:ind w:left="720" w:hanging="360"/>
+      </w:pPr>
+      <w:rPr>
+        <w:rFonts w:ascii="Symbol" w:hAnsi="Symbol" w:hint="default"/>
+        <w:sz w:val="20"/>
+      </w:rPr>
+    </w:lvl>
+    <w:lvl w:ilvl="1" w:tentative="1">
+      <w:start w:val="1"/>
+      <w:numFmt w:val="bullet"/>
+      <w:lvlText w:val="o"/>
+      <w:lvlJc w:val="left"/>
+      <w:pPr>
+        <w:tabs>
+          <w:tab w:val="num" w:pos="1440"/>
+        </w:tabs>
+        <w:ind w:left="1440" w:hanging="360"/>
+      </w:pPr>
+      <w:rPr>
+        <w:rFonts w:ascii="Courier New" w:hAnsi="Courier New" w:hint="default"/>
+        <w:sz w:val="20"/>
+      </w:rPr>
+    </w:lvl>
+    <w:lvl w:ilvl="2" w:tentative="1">
+      <w:start w:val="1"/>
+      <w:numFmt w:val="bullet"/>
+      <w:lvlText w:val=""/>
+      <w:lvlJc w:val="left"/>
+      <w:pPr>
+        <w:tabs>
+          <w:tab w:val="num" w:pos="2160"/>
+        </w:tabs>
+        <w:ind w:left="2160" w:hanging="360"/>
+      </w:pPr>
+      <w:rPr>
+        <w:rFonts w:ascii="Wingdings" w:hAnsi="Wingdings" w:hint="default"/>
+        <w:sz w:val="20"/>
+      </w:rPr>
+    </w:lvl>
+    <w:lvl w:ilvl="3" w:tentative="1">
+      <w:start w:val="1"/>
+      <w:numFmt w:val="bullet"/>
+      <w:lvlText w:val=""/>
+      <w:lvlJc w:val="left"/>
+      <w:pPr>
+        <w:tabs>
+          <w:tab w:val="num" w:pos="2880"/>
+        </w:tabs>
+        <w:ind w:left="2880" w:hanging="360"/>
+      </w:pPr>
+      <w:rPr>
+        <w:rFonts w:ascii="Wingdings" w:hAnsi="Wingdings" w:hint="default"/>
+        <w:sz w:val="20"/>
+      </w:rPr>
+    </w:lvl>
+    <w:lvl w:ilvl="4" w:tentative="1">
+      <w:start w:val="1"/>
+      <w:numFmt w:val="bullet"/>
+      <w:lvlText w:val=""/>
+      <w:lvlJc w:val="left"/>
+      <w:pPr>
+        <w:tabs>
+          <w:tab w:val="num" w:pos="3600"/>
+        </w:tabs>
+        <w:ind w:left="3600" w:hanging="360"/>
+      </w:pPr>
+      <w:rPr>
+        <w:rFonts w:ascii="Wingdings" w:hAnsi="Wingdings" w:hint="default"/>
+        <w:sz w:val="20"/>
+      </w:rPr>
+    </w:lvl>
+    <w:lvl w:ilvl="5" w:tentative="1">
+      <w:start w:val="1"/>
+      <w:numFmt w:val="bullet"/>
+      <w:lvlText w:val=""/>
+      <w:lvlJc w:val="left"/>
+      <w:pPr>
+        <w:tabs>
+          <w:tab w:val="num" w:pos="4320"/>
+        </w:tabs>
+        <w:ind w:left="4320" w:hanging="360"/>
+      </w:pPr>
+      <w:rPr>
+        <w:rFonts w:ascii="Wingdings" w:hAnsi="Wingdings" w:hint="default"/>
+        <w:sz w:val="20"/>
+      </w:rPr>
+    </w:lvl>
+    <w:lvl w:ilvl="6" w:tentative="1">
+      <w:start w:val="1"/>
+      <w:numFmt w:val="bullet"/>
+      <w:lvlText w:val=""/>
+      <w:lvlJc w:val="left"/>
+      <w:pPr>
+        <w:tabs>
+          <w:tab w:val="num" w:pos="5040"/>
+        </w:tabs>
+        <w:ind w:left="5040" w:hanging="360"/>
+      </w:pPr>
+      <w:rPr>
+        <w:rFonts w:ascii="Wingdings" w:hAnsi="Wingdings" w:hint="default"/>
+        <w:sz w:val="20"/>
+      </w:rPr>
+    </w:lvl>
+    <w:lvl w:ilvl="7" w:tentative="1">
+      <w:start w:val="1"/>
+      <w:numFmt w:val="bullet"/>
+      <w:lvlText w:val=""/>
+      <w:lvlJc w:val="left"/>
+      <w:pPr>
+        <w:tabs>
+          <w:tab w:val="num" w:pos="5760"/>
+        </w:tabs>
+        <w:ind w:left="5760" w:hanging="360"/>
+      </w:pPr>
+      <w:rPr>
+        <w:rFonts w:ascii="Wingdings" w:hAnsi="Wingdings" w:hint="default"/>
+        <w:sz w:val="20"/>
+      </w:rPr>
+    </w:lvl>
+    <w:lvl w:ilvl="8" w:tentative="1">
+      <w:start w:val="1"/>
+      <w:numFmt w:val="bullet"/>
+      <w:lvlText w:val=""/>
+      <w:lvlJc w:val="left"/>
+      <w:pPr>
+        <w:tabs>
+          <w:tab w:val="num" w:pos="6480"/>
+        </w:tabs>
+        <w:ind w:left="6480" w:hanging="360"/>
+      </w:pPr>
+      <w:rPr>
+        <w:rFonts w:ascii="Wingdings" w:hAnsi="Wingdings" w:hint="default"/>
+        <w:sz w:val="20"/>
+      </w:rPr>
+    </w:lvl>
+  </w:abstractNum>
+  <w:abstractNum w:abstractNumId="7" w15:restartNumberingAfterBreak="0">
+    <w:nsid w:val="6AFC09A4"/>
+    <w:multiLevelType w:val="multilevel"/>
+    <w:tmpl w:val="1D9E9B1A"/>
+    <w:lvl w:ilvl="0">
+      <w:start w:val="1"/>
+      <w:numFmt w:val="bullet"/>
+      <w:lvlText w:val=""/>
+      <w:lvlJc w:val="left"/>
+      <w:pPr>
+        <w:tabs>
+          <w:tab w:val="num" w:pos="720"/>
+        </w:tabs>
+        <w:ind w:left="720" w:hanging="360"/>
+      </w:pPr>
+      <w:rPr>
+        <w:rFonts w:ascii="Symbol" w:hAnsi="Symbol" w:hint="default"/>
+        <w:sz w:val="20"/>
+      </w:rPr>
+    </w:lvl>
+    <w:lvl w:ilvl="1" w:tentative="1">
+      <w:start w:val="1"/>
+      <w:numFmt w:val="bullet"/>
+      <w:lvlText w:val="o"/>
+      <w:lvlJc w:val="left"/>
+      <w:pPr>
+        <w:tabs>
+          <w:tab w:val="num" w:pos="1440"/>
+        </w:tabs>
+        <w:ind w:left="1440" w:hanging="360"/>
+      </w:pPr>
+      <w:rPr>
+        <w:rFonts w:ascii="Courier New" w:hAnsi="Courier New" w:hint="default"/>
+        <w:sz w:val="20"/>
+      </w:rPr>
+    </w:lvl>
+    <w:lvl w:ilvl="2" w:tentative="1">
+      <w:start w:val="1"/>
+      <w:numFmt w:val="bullet"/>
+      <w:lvlText w:val=""/>
+      <w:lvlJc w:val="left"/>
+      <w:pPr>
+        <w:tabs>
+          <w:tab w:val="num" w:pos="2160"/>
+        </w:tabs>
+        <w:ind w:left="2160" w:hanging="360"/>
+      </w:pPr>
+      <w:rPr>
+        <w:rFonts w:ascii="Wingdings" w:hAnsi="Wingdings" w:hint="default"/>
+        <w:sz w:val="20"/>
+      </w:rPr>
+    </w:lvl>
+    <w:lvl w:ilvl="3" w:tentative="1">
+      <w:start w:val="1"/>
+      <w:numFmt w:val="bullet"/>
+      <w:lvlText w:val=""/>
+      <w:lvlJc w:val="left"/>
+      <w:pPr>
+        <w:tabs>
+          <w:tab w:val="num" w:pos="2880"/>
+        </w:tabs>
+        <w:ind w:left="2880" w:hanging="360"/>
+      </w:pPr>
+      <w:rPr>
+        <w:rFonts w:ascii="Wingdings" w:hAnsi="Wingdings" w:hint="default"/>
+        <w:sz w:val="20"/>
+      </w:rPr>
+    </w:lvl>
+    <w:lvl w:ilvl="4" w:tentative="1">
+      <w:start w:val="1"/>
+      <w:numFmt w:val="bullet"/>
+      <w:lvlText w:val=""/>
+      <w:lvlJc w:val="left"/>
+      <w:pPr>
+        <w:tabs>
+          <w:tab w:val="num" w:pos="3600"/>
+        </w:tabs>
+        <w:ind w:left="3600" w:hanging="360"/>
+      </w:pPr>
+      <w:rPr>
+        <w:rFonts w:ascii="Wingdings" w:hAnsi="Wingdings" w:hint="default"/>
+        <w:sz w:val="20"/>
+      </w:rPr>
+    </w:lvl>
+    <w:lvl w:ilvl="5" w:tentative="1">
+      <w:start w:val="1"/>
+      <w:numFmt w:val="bullet"/>
+      <w:lvlText w:val=""/>
+      <w:lvlJc w:val="left"/>
+      <w:pPr>
+        <w:tabs>
+          <w:tab w:val="num" w:pos="4320"/>
+        </w:tabs>
+        <w:ind w:left="4320" w:hanging="360"/>
+      </w:pPr>
+      <w:rPr>
+        <w:rFonts w:ascii="Wingdings" w:hAnsi="Wingdings" w:hint="default"/>
+        <w:sz w:val="20"/>
+      </w:rPr>
+    </w:lvl>
+    <w:lvl w:ilvl="6" w:tentative="1">
+      <w:start w:val="1"/>
+      <w:numFmt w:val="bullet"/>
+      <w:lvlText w:val=""/>
+      <w:lvlJc w:val="left"/>
+      <w:pPr>
+        <w:tabs>
+          <w:tab w:val="num" w:pos="5040"/>
+        </w:tabs>
+        <w:ind w:left="5040" w:hanging="360"/>
+      </w:pPr>
+      <w:rPr>
+        <w:rFonts w:ascii="Wingdings" w:hAnsi="Wingdings" w:hint="default"/>
+        <w:sz w:val="20"/>
+      </w:rPr>
+    </w:lvl>
+    <w:lvl w:ilvl="7" w:tentative="1">
+      <w:start w:val="1"/>
+      <w:numFmt w:val="bullet"/>
+      <w:lvlText w:val=""/>
+      <w:lvlJc w:val="left"/>
+      <w:pPr>
+        <w:tabs>
+          <w:tab w:val="num" w:pos="5760"/>
+        </w:tabs>
+        <w:ind w:left="5760" w:hanging="360"/>
+      </w:pPr>
+      <w:rPr>
+        <w:rFonts w:ascii="Wingdings" w:hAnsi="Wingdings" w:hint="default"/>
+        <w:sz w:val="20"/>
+      </w:rPr>
+    </w:lvl>
+    <w:lvl w:ilvl="8" w:tentative="1">
+      <w:start w:val="1"/>
+      <w:numFmt w:val="bullet"/>
+      <w:lvlText w:val=""/>
+      <w:lvlJc w:val="left"/>
+      <w:pPr>
+        <w:tabs>
+          <w:tab w:val="num" w:pos="6480"/>
+        </w:tabs>
+        <w:ind w:left="6480" w:hanging="360"/>
+      </w:pPr>
+      <w:rPr>
+        <w:rFonts w:ascii="Wingdings" w:hAnsi="Wingdings" w:hint="default"/>
+        <w:sz w:val="20"/>
       </w:rPr>
     </w:lvl>
   </w:abstractNum>
@@ -704,7 +2693,25 @@
     <w:abstractNumId w:val="0"/>
   </w:num>
   <w:num w:numId="2" w16cid:durableId="1035692807">
+    <w:abstractNumId w:val="4"/>
+  </w:num>
+  <w:num w:numId="3" w16cid:durableId="435903524">
+    <w:abstractNumId w:val="6"/>
+  </w:num>
+  <w:num w:numId="4" w16cid:durableId="95685534">
     <w:abstractNumId w:val="1"/>
+  </w:num>
+  <w:num w:numId="5" w16cid:durableId="958025365">
+    <w:abstractNumId w:val="5"/>
+  </w:num>
+  <w:num w:numId="6" w16cid:durableId="1433741839">
+    <w:abstractNumId w:val="7"/>
+  </w:num>
+  <w:num w:numId="7" w16cid:durableId="774061351">
+    <w:abstractNumId w:val="3"/>
+  </w:num>
+  <w:num w:numId="8" w16cid:durableId="131026422">
+    <w:abstractNumId w:val="2"/>
   </w:num>
 </w:numbering>
 </file>
@@ -1309,7 +3316,6 @@
   <w:style w:type="character" w:default="1" w:styleId="Fuentedeprrafopredeter">
     <w:name w:val="Default Paragraph Font"/>
     <w:uiPriority w:val="1"/>
-    <w:semiHidden/>
     <w:unhideWhenUsed/>
   </w:style>
   <w:style w:type="table" w:default="1" w:styleId="Tablanormal">

</xml_diff>